<commit_message>
docs: cut the section that restated the executive summary
'What this means for the disagreement' spent 178 words re-arguing who was
right about what, which the executive summary already states. Replaced with
'The practical upshot', 55 words keeping only the part that was not already
said: the three tells that separate the two mechanisms on a single response.

1,918 -> 1,803 prose words. docx rebuilt and re-validated.
</commit_message>
<xml_diff>
--- a/results/Model_Forensics_SPAR_take-home_Mohit_Goyal.docx
+++ b/results/Model_Forensics_SPAR_take-home_Mohit_Goyal.docx
@@ -749,7 +749,7 @@
         </w:rPr>
         <w:t xml:space="preserve">Aditya's </w:t>
       </w:r>
-      <w:hyperlink w:history="1" r:id="rIdjb-pzz_azmnsrms0fkymw">
+      <w:hyperlink w:history="1" r:id="rIdcgu1xbprxsg0kamr7ce1x">
         <w:r>
           <w:rPr>
             <w:rStyle w:val="Hyperlink"/>
@@ -3005,7 +3005,7 @@
         <w:rPr>
           <w:color w:val="1A1A1A"/>
         </w:rPr>
-        <w:t xml:space="preserve">What this means for the disagreement</w:t>
+        <w:t xml:space="preserve">The practical upshot</w:t>
       </w:r>
     </w:p>
     <w:p>
@@ -3018,84 +3018,7 @@
           <w:sz w:val="21"/>
           <w:szCs w:val="21"/>
         </w:rPr>
-        <w:t xml:space="preserve">The two camps were describing different mechanisms and arguing as though there were one.</w:t>
-      </w:r>
-    </w:p>
-    <w:p>
-      <w:pPr>
-        <w:spacing w:after="150" w:line="300"/>
-      </w:pPr>
-      <w:r>
-        <w:rPr>
-          <w:color w:val="1A1A1A"/>
-          <w:sz w:val="21"/>
-          <w:szCs w:val="21"/>
-        </w:rPr>
-        <w:t xml:space="preserve">For the prompts that generated the observation, </w:t>
-      </w:r>
-      <w:r>
-        <w:rPr>
-          <w:b/>
-          <w:bCs/>
-          <w:color w:val="1A1A1A"/>
-          <w:sz w:val="21"/>
-          <w:szCs w:val="21"/>
-        </w:rPr>
-        <w:t xml:space="preserve">Anthropic's conclusion holds</w:t>
-      </w:r>
-      <w:r>
-        <w:rPr>
-          <w:color w:val="1A1A1A"/>
-          <w:sz w:val="21"/>
-          <w:szCs w:val="21"/>
-        </w:rPr>
-        <w:t xml:space="preserve">: this is not misalignment. It is caution under uncertainty, and most of it is not refusal at all. But the specific mechanism they name, the model treating the prompt as an attack, is the weaker of the two drivers. The stronger driver is not suspicion of the requester. It is inability to tell what the training change will do.</w:t>
-      </w:r>
-    </w:p>
-    <w:p>
-      <w:pPr>
-        <w:spacing w:after="150" w:line="300"/>
-      </w:pPr>
-      <w:r>
-        <w:rPr>
-          <w:b/>
-          <w:bCs/>
-          <w:color w:val="1A1A1A"/>
-          <w:sz w:val="21"/>
-          <w:szCs w:val="21"/>
-        </w:rPr>
-        <w:t xml:space="preserve">UK AISI's concern is real but misattributed.</w:t>
-      </w:r>
-      <w:r>
-        <w:rPr>
-          <w:color w:val="1A1A1A"/>
-          <w:sz w:val="21"/>
-          <w:szCs w:val="21"/>
-        </w:rPr>
-        <w:t xml:space="preserve"> The model does hold an object-level position, it is strong, and neither reflection nor institutional authority shifts it. That disposition was not what those prompts were measuring.</w:t>
-      </w:r>
-    </w:p>
-    <w:p>
-      <w:pPr>
-        <w:spacing w:after="150" w:line="300"/>
-      </w:pPr>
-      <w:r>
-        <w:rPr>
-          <w:b/>
-          <w:bCs/>
-          <w:color w:val="1A1A1A"/>
-          <w:sz w:val="21"/>
-          <w:szCs w:val="21"/>
-        </w:rPr>
-        <w:t xml:space="preserve">The practical upshot</w:t>
-      </w:r>
-      <w:r>
-        <w:rPr>
-          <w:color w:val="1A1A1A"/>
-          <w:sz w:val="21"/>
-          <w:szCs w:val="21"/>
-        </w:rPr>
-        <w:t xml:space="preserve"> is that a first-turn refusal rate is not a measurement of anything until the two mechanisms are separated. They can be separated cheaply, on a single response, by three tells: whether the prompts were delivered, whether the model asked about authorisation or argued the harm, and whether reflection changes the answer.</w:t>
+        <w:t xml:space="preserve">A first-turn refusal rate measures nothing until the two mechanisms are separated. They separate cheaply, on a single response, by three tells: whether the requested work was delivered, whether the model asked about authorisation or argued the harm, and whether letting it reason first changes the answer.</w:t>
       </w:r>
     </w:p>
     <w:p>
@@ -3492,7 +3415,7 @@
         </w:rPr>
         <w:t xml:space="preserve">Built on Aditya Singh's </w:t>
       </w:r>
-      <w:hyperlink w:history="1" r:id="rIdu8hb0m_jk373jq5c-_rnh">
+      <w:hyperlink w:history="1" r:id="rIddl-xsfdmedvxcuzw6b5pk">
         <w:r>
           <w:rPr>
             <w:rStyle w:val="Hyperlink"/>

</xml_diff>

<commit_message>
docs: link the repo and state that every number is generated
Adds the repo URL to the reproduction section, and one line saying the figure,
the appendix table and every number in the text are built from the stored
responses rather than transcribed. That is the claim a reviewer would otherwise
have to take on trust.
</commit_message>
<xml_diff>
--- a/results/Model_Forensics_SPAR_take-home_Mohit_Goyal.docx
+++ b/results/Model_Forensics_SPAR_take-home_Mohit_Goyal.docx
@@ -749,7 +749,7 @@
         </w:rPr>
         <w:t xml:space="preserve">Aditya's </w:t>
       </w:r>
-      <w:hyperlink w:history="1" r:id="rIdcgu1xbprxsg0kamr7ce1x">
+      <w:hyperlink w:history="1" r:id="rIdforj6uep5ga61jcltumxn">
         <w:r>
           <w:rPr>
             <w:rStyle w:val="Hyperlink"/>
@@ -837,6 +837,19 @@
           <w:szCs w:val="21"/>
         </w:rPr>
         <w:t xml:space="preserve">, asserted as a test, so the numbers are directly comparable. At n=30 I measure 97% withholding where he reported 100% at n=50.</w:t>
+      </w:r>
+    </w:p>
+    <w:p>
+      <w:pPr>
+        <w:spacing w:after="150" w:line="300"/>
+      </w:pPr>
+      <w:r>
+        <w:rPr>
+          <w:color w:val="1A1A1A"/>
+          <w:sz w:val="21"/>
+          <w:szCs w:val="21"/>
+        </w:rPr>
+        <w:t xml:space="preserve">Every number in this document is generated from the stored responses at build time, including the figure and the appendix table, so nothing here is transcribed by hand.</w:t>
       </w:r>
     </w:p>
     <w:p>
@@ -3350,7 +3363,25 @@
           <w:sz w:val="21"/>
           <w:szCs w:val="21"/>
         </w:rPr>
-        <w:t xml:space="preserve">Code, data and figure: 540 stored responses, 560 verdicts, and 130 tests covering prompt composition, grading, budget guards and the calibration of the mechanical check.</w:t>
+        <w:t xml:space="preserve">Code, data and figure: </w:t>
+      </w:r>
+      <w:r>
+        <w:rPr>
+          <w:b/>
+          <w:bCs/>
+          <w:color w:val="1A1A1A"/>
+          <w:sz w:val="21"/>
+          <w:szCs w:val="21"/>
+        </w:rPr>
+        <w:t xml:space="preserve">https://github.com/MohitGoyal09/refusal-mechanisms</w:t>
+      </w:r>
+      <w:r>
+        <w:rPr>
+          <w:color w:val="1A1A1A"/>
+          <w:sz w:val="21"/>
+          <w:szCs w:val="21"/>
+        </w:rPr>
+        <w:t xml:space="preserve">. 540 stored responses, 560 verdicts, and 130 tests covering prompt composition, grading, budget guards and the calibration of the mechanical check.</w:t>
       </w:r>
     </w:p>
     <w:p>
@@ -3415,7 +3446,7 @@
         </w:rPr>
         <w:t xml:space="preserve">Built on Aditya Singh's </w:t>
       </w:r>
-      <w:hyperlink w:history="1" r:id="rIddl-xsfdmedvxcuzw6b5pk">
+      <w:hyperlink w:history="1" r:id="rIdlnmmckhmcubwze-bfum0-">
         <w:r>
           <w:rPr>
             <w:rStyle w:val="Hyperlink"/>

</xml_diff>

<commit_message>
docs: note hours spent, as his email asks for
He wrote: if you do not have the bandwidth for 5 hours, note on the write-up
doc how long you spent. 4 hours hands-on, with sweeps and grading excluded
since they ran unattended and he explicitly allows coding agents.
</commit_message>
<xml_diff>
--- a/results/Model_Forensics_SPAR_take-home_Mohit_Goyal.docx
+++ b/results/Model_Forensics_SPAR_take-home_Mohit_Goyal.docx
@@ -25,6 +25,19 @@
           <w:szCs w:val="21"/>
         </w:rPr>
         <w:t xml:space="preserve">Mohit Goyal · SPAR Model Forensics take-home · August 2026</w:t>
+      </w:r>
+    </w:p>
+    <w:p>
+      <w:pPr>
+        <w:spacing w:after="150" w:line="300"/>
+      </w:pPr>
+      <w:r>
+        <w:rPr>
+          <w:color w:val="1A1A1A"/>
+          <w:sz w:val="21"/>
+          <w:szCs w:val="21"/>
+        </w:rPr>
+        <w:t xml:space="preserve">Time spent: about 4 hours hands-on. Experiment execution and grading ran unattended and are not counted.</w:t>
       </w:r>
     </w:p>
     <w:p>
@@ -749,7 +762,7 @@
         </w:rPr>
         <w:t xml:space="preserve">Aditya's </w:t>
       </w:r>
-      <w:hyperlink w:history="1" r:id="rIdforj6uep5ga61jcltumxn">
+      <w:hyperlink w:history="1" r:id="rIdmf9aww0aoy5pfcptrtrxc">
         <w:r>
           <w:rPr>
             <w:rStyle w:val="Hyperlink"/>
@@ -3446,7 +3459,7 @@
         </w:rPr>
         <w:t xml:space="preserve">Built on Aditya Singh's </w:t>
       </w:r>
-      <w:hyperlink w:history="1" r:id="rIdlnmmckhmcubwze-bfum0-">
+      <w:hyperlink w:history="1" r:id="rIdlxsgxqaljvp60de8ycnw0">
         <w:r>
           <w:rPr>
             <w:rStyle w:val="Hyperlink"/>

</xml_diff>